<commit_message>
docs: generate figures 9, 11-14 PNG; clarify OLAP.md
OLAP star and Docker deploy diagrams; EXPLAIN plans as images. Only figure 10 remains a user screenshot.

Co-authored-by: Cursor <cursoragent@cursor.com>
</commit_message>
<xml_diff>
--- a/docs/KURSOVAYA_BD.docx
+++ b/docs/KURSOVAYA_BD.docx
@@ -4245,59 +4245,137 @@
         </w:rPr>
         <w:t xml:space="preserve">).</w:t>
       </w:r>
-      <w:r>
-        <w:rPr>
-          <w:rFonts w:ascii="Times New Roman" w:hAnsi="Times New Roman"/>
-          <w:color w:val="000000"/>
-        </w:rPr>
-        <w:t xml:space="preserve"> </w:t>
-      </w:r>
-      <w:r>
-        <w:rPr>
-          <w:rFonts w:ascii="Times New Roman" w:hAnsi="Times New Roman"/>
-          <w:color w:val="000000"/>
-        </w:rPr>
-        <w:t xml:space="preserve">«Рисунок 3 — BPMN процесса завершения задачи».*</w:t>
-      </w:r>
     </w:p>
     <w:p>
       <w:pPr>
-        <w:pStyle w:val="GOSTFigureCaption"/>
-      </w:pPr>
-      <w:r>
-        <w:rPr>
-          <w:rFonts w:ascii="Times New Roman" w:hAnsi="Times New Roman"/>
-          <w:color w:val="000000"/>
-        </w:rPr>
-        <w:t xml:space="preserve">Рисунок 5 — Диаграмма состояний жизненного цикла задачи</w:t>
+        <w:pStyle w:val="BlockText"/>
+      </w:pPr>
+      <w:r>
+        <w:rPr>
+          <w:rFonts w:ascii="Times New Roman" w:hAnsi="Times New Roman"/>
+          <w:b/>
+          <w:bCs/>
+          <w:color w:val="000000"/>
+        </w:rPr>
+        <w:t xml:space="preserve">Подпись под рисунком:</w:t>
+      </w:r>
+      <w:r>
+        <w:rPr>
+          <w:rFonts w:ascii="Times New Roman" w:hAnsi="Times New Roman"/>
+          <w:color w:val="000000"/>
+        </w:rPr>
+        <w:t xml:space="preserve"> </w:t>
+      </w:r>
+      <w:r>
+        <w:rPr>
+          <w:rFonts w:ascii="Times New Roman" w:hAnsi="Times New Roman"/>
+          <w:color w:val="000000"/>
+        </w:rPr>
+        <w:t xml:space="preserve">«Рисунок 3 — BPMN процесса завершения задачи»</w:t>
       </w:r>
     </w:p>
     <w:p>
       <w:pPr>
-        <w:pStyle w:val="GOSTPlaceholder"/>
-      </w:pPr>
-      <w:r>
-        <w:rPr>
-          <w:rFonts w:ascii="Times New Roman" w:hAnsi="Times New Roman"/>
-          <w:color w:val="000000"/>
-        </w:rPr>
-        <w:t xml:space="preserve">Рисунок 5 — Диаграмма состояний жизненного цикла задачи</w:t>
+        <w:pStyle w:val="BlockText"/>
+      </w:pPr>
+      <w:r>
+        <w:rPr>
+          <w:rFonts w:ascii="Times New Roman" w:hAnsi="Times New Roman"/>
+          <w:b/>
+          <w:bCs/>
+          <w:color w:val="000000"/>
+        </w:rPr>
+        <w:t xml:space="preserve">Уже вставлено</w:t>
+      </w:r>
+      <w:r>
+        <w:rPr>
+          <w:rFonts w:ascii="Times New Roman" w:hAnsi="Times New Roman"/>
+          <w:color w:val="000000"/>
+        </w:rPr>
+        <w:t xml:space="preserve"> </w:t>
+      </w:r>
+      <w:r>
+        <w:rPr>
+          <w:rFonts w:ascii="Times New Roman" w:hAnsi="Times New Roman"/>
+          <w:color w:val="000000"/>
+        </w:rPr>
+        <w:t xml:space="preserve">(PNG:</w:t>
+      </w:r>
+      <w:r>
+        <w:rPr>
+          <w:rFonts w:ascii="Times New Roman" w:hAnsi="Times New Roman"/>
+          <w:color w:val="000000"/>
+        </w:rPr>
+        <w:t xml:space="preserve"> </w:t>
+      </w:r>
+      <w:r>
+        <w:rPr>
+          <w:rStyle w:val="VerbatimChar"/>
+          <w:rFonts w:ascii="Times New Roman" w:hAnsi="Times New Roman"/>
+          <w:color w:val="000000"/>
+        </w:rPr>
+        <w:t xml:space="preserve">docs/diagrams/png/03-bpmn-complete-task.png</w:t>
+      </w:r>
+      <w:r>
+        <w:rPr>
+          <w:rFonts w:ascii="Times New Roman" w:hAnsi="Times New Roman"/>
+          <w:color w:val="000000"/>
+        </w:rPr>
+        <w:t xml:space="preserve">).</w:t>
+      </w:r>
+      <w:r>
+        <w:rPr>
+          <w:rFonts w:ascii="Times New Roman" w:hAnsi="Times New Roman"/>
+          <w:color w:val="000000"/>
+        </w:rPr>
+        <w:t xml:space="preserve"> </w:t>
+      </w:r>
+      <w:r>
+        <w:rPr>
+          <w:rFonts w:ascii="Times New Roman" w:hAnsi="Times New Roman"/>
+          <w:color w:val="000000"/>
+        </w:rPr>
+        <w:t xml:space="preserve">«Рисунок 3 — BPMN процесса завершения задачи».*</w:t>
       </w:r>
     </w:p>
     <w:p>
       <w:pPr>
-        <w:pStyle w:val="GOSTPlaceholder"/>
-      </w:pPr>
-      <w:r>
-        <w:rPr>
-          <w:rFonts w:ascii="Times New Roman" w:hAnsi="Times New Roman"/>
-          <w:color w:val="000000"/>
-        </w:rPr>
-        <w:t xml:space="preserve">Содержание рисунка. Состояния: к выполнению, в работе, выполнена, просрочена, отменена. Переход в «просрочена» после отметки о выполнении показан как автоматический (не действие пользователя).</w:t>
+        <w:pStyle w:val="GOSTFigureCaption"/>
+      </w:pPr>
+      <w:r>
+        <w:rPr>
+          <w:rFonts w:ascii="Times New Roman" w:hAnsi="Times New Roman"/>
+          <w:color w:val="000000"/>
+        </w:rPr>
+        <w:t xml:space="preserve">Рисунок 5 — Диаграмма состояний жизненного цикла задачи</w:t>
       </w:r>
     </w:p>
     <w:p>
       <w:pPr>
+        <w:pStyle w:val="GOSTPlaceholder"/>
+      </w:pPr>
+      <w:r>
+        <w:rPr>
+          <w:rFonts w:ascii="Times New Roman" w:hAnsi="Times New Roman"/>
+          <w:color w:val="000000"/>
+        </w:rPr>
+        <w:t xml:space="preserve">Рисунок 5 — Диаграмма состояний жизненного цикла задачи</w:t>
+      </w:r>
+    </w:p>
+    <w:p>
+      <w:pPr>
+        <w:pStyle w:val="GOSTPlaceholder"/>
+      </w:pPr>
+      <w:r>
+        <w:rPr>
+          <w:rFonts w:ascii="Times New Roman" w:hAnsi="Times New Roman"/>
+          <w:color w:val="000000"/>
+        </w:rPr>
+        <w:t xml:space="preserve">Содержание рисунка. Состояния: к выполнению, в работе, выполнена, просрочена, отменена. Переход в «просрочена» после отметки о выполнении показан как автоматический (не действие пользователя).</w:t>
+      </w:r>
+    </w:p>
+    <w:p>
+      <w:pPr>
         <w:pStyle w:val="BlockText"/>
       </w:pPr>
       <w:r>
@@ -4322,6 +4400,84 @@
           <w:color w:val="000000"/>
         </w:rPr>
         <w:t xml:space="preserve">Состояния: к выполнению, в работе, выполнена, просрочена, отменена. Переход в «просрочена» после отметки о выполнении показан как автоматический (не действие пользователя).</w:t>
+      </w:r>
+    </w:p>
+    <w:p>
+      <w:pPr>
+        <w:pStyle w:val="BlockText"/>
+      </w:pPr>
+      <w:r>
+        <w:rPr>
+          <w:rFonts w:ascii="Times New Roman" w:hAnsi="Times New Roman"/>
+          <w:b/>
+          <w:bCs/>
+          <w:color w:val="000000"/>
+        </w:rPr>
+        <w:t xml:space="preserve">Подпись под рисунком:</w:t>
+      </w:r>
+      <w:r>
+        <w:rPr>
+          <w:rFonts w:ascii="Times New Roman" w:hAnsi="Times New Roman"/>
+          <w:color w:val="000000"/>
+        </w:rPr>
+        <w:t xml:space="preserve"> </w:t>
+      </w:r>
+      <w:r>
+        <w:rPr>
+          <w:rFonts w:ascii="Times New Roman" w:hAnsi="Times New Roman"/>
+          <w:color w:val="000000"/>
+        </w:rPr>
+        <w:t xml:space="preserve">«Рисунок 5 — Диаграмма состояний жизненного цикла задачи»</w:t>
+      </w:r>
+    </w:p>
+    <w:p>
+      <w:pPr>
+        <w:pStyle w:val="BlockText"/>
+      </w:pPr>
+      <w:r>
+        <w:rPr>
+          <w:rFonts w:ascii="Times New Roman" w:hAnsi="Times New Roman"/>
+          <w:b/>
+          <w:bCs/>
+          <w:color w:val="000000"/>
+        </w:rPr>
+        <w:t xml:space="preserve">Уже вставлено</w:t>
+      </w:r>
+      <w:r>
+        <w:rPr>
+          <w:rFonts w:ascii="Times New Roman" w:hAnsi="Times New Roman"/>
+          <w:color w:val="000000"/>
+        </w:rPr>
+        <w:t xml:space="preserve"> </w:t>
+      </w:r>
+      <w:r>
+        <w:rPr>
+          <w:rFonts w:ascii="Times New Roman" w:hAnsi="Times New Roman"/>
+          <w:color w:val="000000"/>
+        </w:rPr>
+        <w:t xml:space="preserve">(PNG:</w:t>
+      </w:r>
+      <w:r>
+        <w:rPr>
+          <w:rFonts w:ascii="Times New Roman" w:hAnsi="Times New Roman"/>
+          <w:color w:val="000000"/>
+        </w:rPr>
+        <w:t xml:space="preserve"> </w:t>
+      </w:r>
+      <w:r>
+        <w:rPr>
+          <w:rStyle w:val="VerbatimChar"/>
+          <w:rFonts w:ascii="Times New Roman" w:hAnsi="Times New Roman"/>
+          <w:color w:val="000000"/>
+        </w:rPr>
+        <w:t xml:space="preserve">docs/diagrams/png/05-state-task.png</w:t>
+      </w:r>
+      <w:r>
+        <w:rPr>
+          <w:rFonts w:ascii="Times New Roman" w:hAnsi="Times New Roman"/>
+          <w:color w:val="000000"/>
+        </w:rPr>
+        <w:t xml:space="preserve">).</w:t>
       </w:r>
     </w:p>
     <w:p>
@@ -5223,59 +5379,137 @@
         </w:rPr>
         <w:t xml:space="preserve">).</w:t>
       </w:r>
-      <w:r>
-        <w:rPr>
-          <w:rFonts w:ascii="Times New Roman" w:hAnsi="Times New Roman"/>
-          <w:color w:val="000000"/>
-        </w:rPr>
-        <w:t xml:space="preserve"> </w:t>
-      </w:r>
-      <w:r>
-        <w:rPr>
-          <w:rFonts w:ascii="Times New Roman" w:hAnsi="Times New Roman"/>
-          <w:color w:val="000000"/>
-        </w:rPr>
-        <w:t xml:space="preserve">«Рисунок 4 — BPMN суточного цикла привычки».*</w:t>
-      </w:r>
     </w:p>
     <w:p>
       <w:pPr>
-        <w:pStyle w:val="GOSTFigureCaption"/>
-      </w:pPr>
-      <w:r>
-        <w:rPr>
-          <w:rFonts w:ascii="Times New Roman" w:hAnsi="Times New Roman"/>
-          <w:color w:val="000000"/>
-        </w:rPr>
-        <w:t xml:space="preserve">Рисунок 6 — Диаграмма состояний слота отклика на привычку</w:t>
+        <w:pStyle w:val="BlockText"/>
+      </w:pPr>
+      <w:r>
+        <w:rPr>
+          <w:rFonts w:ascii="Times New Roman" w:hAnsi="Times New Roman"/>
+          <w:b/>
+          <w:bCs/>
+          <w:color w:val="000000"/>
+        </w:rPr>
+        <w:t xml:space="preserve">Подпись под рисунком:</w:t>
+      </w:r>
+      <w:r>
+        <w:rPr>
+          <w:rFonts w:ascii="Times New Roman" w:hAnsi="Times New Roman"/>
+          <w:color w:val="000000"/>
+        </w:rPr>
+        <w:t xml:space="preserve"> </w:t>
+      </w:r>
+      <w:r>
+        <w:rPr>
+          <w:rFonts w:ascii="Times New Roman" w:hAnsi="Times New Roman"/>
+          <w:color w:val="000000"/>
+        </w:rPr>
+        <w:t xml:space="preserve">«Рисунок 4 — BPMN суточного цикла привычки»</w:t>
       </w:r>
     </w:p>
     <w:p>
       <w:pPr>
-        <w:pStyle w:val="GOSTPlaceholder"/>
-      </w:pPr>
-      <w:r>
-        <w:rPr>
-          <w:rFonts w:ascii="Times New Roman" w:hAnsi="Times New Roman"/>
-          <w:color w:val="000000"/>
-        </w:rPr>
-        <w:t xml:space="preserve">Рисунок 6 — Диаграмма состояний слота отклика на привычку</w:t>
+        <w:pStyle w:val="BlockText"/>
+      </w:pPr>
+      <w:r>
+        <w:rPr>
+          <w:rFonts w:ascii="Times New Roman" w:hAnsi="Times New Roman"/>
+          <w:b/>
+          <w:bCs/>
+          <w:color w:val="000000"/>
+        </w:rPr>
+        <w:t xml:space="preserve">Уже вставлено</w:t>
+      </w:r>
+      <w:r>
+        <w:rPr>
+          <w:rFonts w:ascii="Times New Roman" w:hAnsi="Times New Roman"/>
+          <w:color w:val="000000"/>
+        </w:rPr>
+        <w:t xml:space="preserve"> </w:t>
+      </w:r>
+      <w:r>
+        <w:rPr>
+          <w:rFonts w:ascii="Times New Roman" w:hAnsi="Times New Roman"/>
+          <w:color w:val="000000"/>
+        </w:rPr>
+        <w:t xml:space="preserve">(PNG:</w:t>
+      </w:r>
+      <w:r>
+        <w:rPr>
+          <w:rFonts w:ascii="Times New Roman" w:hAnsi="Times New Roman"/>
+          <w:color w:val="000000"/>
+        </w:rPr>
+        <w:t xml:space="preserve"> </w:t>
+      </w:r>
+      <w:r>
+        <w:rPr>
+          <w:rStyle w:val="VerbatimChar"/>
+          <w:rFonts w:ascii="Times New Roman" w:hAnsi="Times New Roman"/>
+          <w:color w:val="000000"/>
+        </w:rPr>
+        <w:t xml:space="preserve">docs/diagrams/png/04-bpmn-pattern-habit.png</w:t>
+      </w:r>
+      <w:r>
+        <w:rPr>
+          <w:rFonts w:ascii="Times New Roman" w:hAnsi="Times New Roman"/>
+          <w:color w:val="000000"/>
+        </w:rPr>
+        <w:t xml:space="preserve">).</w:t>
+      </w:r>
+      <w:r>
+        <w:rPr>
+          <w:rFonts w:ascii="Times New Roman" w:hAnsi="Times New Roman"/>
+          <w:color w:val="000000"/>
+        </w:rPr>
+        <w:t xml:space="preserve"> </w:t>
+      </w:r>
+      <w:r>
+        <w:rPr>
+          <w:rFonts w:ascii="Times New Roman" w:hAnsi="Times New Roman"/>
+          <w:color w:val="000000"/>
+        </w:rPr>
+        <w:t xml:space="preserve">«Рисунок 4 — BPMN суточного цикла привычки».*</w:t>
       </w:r>
     </w:p>
     <w:p>
       <w:pPr>
-        <w:pStyle w:val="GOSTPlaceholder"/>
-      </w:pPr>
-      <w:r>
-        <w:rPr>
-          <w:rFonts w:ascii="Times New Roman" w:hAnsi="Times New Roman"/>
-          <w:color w:val="000000"/>
-        </w:rPr>
-        <w:t xml:space="preserve">Содержание рисунка. Состояния слота: ожидание ответа → отвечено или пропущено (по истечении регламентного интервала без ответа).</w:t>
+        <w:pStyle w:val="GOSTFigureCaption"/>
+      </w:pPr>
+      <w:r>
+        <w:rPr>
+          <w:rFonts w:ascii="Times New Roman" w:hAnsi="Times New Roman"/>
+          <w:color w:val="000000"/>
+        </w:rPr>
+        <w:t xml:space="preserve">Рисунок 6 — Диаграмма состояний слота отклика на привычку</w:t>
       </w:r>
     </w:p>
     <w:p>
       <w:pPr>
+        <w:pStyle w:val="GOSTPlaceholder"/>
+      </w:pPr>
+      <w:r>
+        <w:rPr>
+          <w:rFonts w:ascii="Times New Roman" w:hAnsi="Times New Roman"/>
+          <w:color w:val="000000"/>
+        </w:rPr>
+        <w:t xml:space="preserve">Рисунок 6 — Диаграмма состояний слота отклика на привычку</w:t>
+      </w:r>
+    </w:p>
+    <w:p>
+      <w:pPr>
+        <w:pStyle w:val="GOSTPlaceholder"/>
+      </w:pPr>
+      <w:r>
+        <w:rPr>
+          <w:rFonts w:ascii="Times New Roman" w:hAnsi="Times New Roman"/>
+          <w:color w:val="000000"/>
+        </w:rPr>
+        <w:t xml:space="preserve">Содержание рисунка. Состояния слота: ожидание ответа → отвечено или пропущено (по истечении регламентного интервала без ответа).</w:t>
+      </w:r>
+    </w:p>
+    <w:p>
+      <w:pPr>
         <w:pStyle w:val="BlockText"/>
       </w:pPr>
       <w:r>
@@ -5300,6 +5534,84 @@
           <w:color w:val="000000"/>
         </w:rPr>
         <w:t xml:space="preserve">Состояния слота: ожидание ответа → отвечено или пропущено (по истечении регламентного интервала без ответа).</w:t>
+      </w:r>
+    </w:p>
+    <w:p>
+      <w:pPr>
+        <w:pStyle w:val="BlockText"/>
+      </w:pPr>
+      <w:r>
+        <w:rPr>
+          <w:rFonts w:ascii="Times New Roman" w:hAnsi="Times New Roman"/>
+          <w:b/>
+          <w:bCs/>
+          <w:color w:val="000000"/>
+        </w:rPr>
+        <w:t xml:space="preserve">Подпись под рисунком:</w:t>
+      </w:r>
+      <w:r>
+        <w:rPr>
+          <w:rFonts w:ascii="Times New Roman" w:hAnsi="Times New Roman"/>
+          <w:color w:val="000000"/>
+        </w:rPr>
+        <w:t xml:space="preserve"> </w:t>
+      </w:r>
+      <w:r>
+        <w:rPr>
+          <w:rFonts w:ascii="Times New Roman" w:hAnsi="Times New Roman"/>
+          <w:color w:val="000000"/>
+        </w:rPr>
+        <w:t xml:space="preserve">«Рисунок 6 — Диаграмма состояний слота отклика на привычку»</w:t>
+      </w:r>
+    </w:p>
+    <w:p>
+      <w:pPr>
+        <w:pStyle w:val="BlockText"/>
+      </w:pPr>
+      <w:r>
+        <w:rPr>
+          <w:rFonts w:ascii="Times New Roman" w:hAnsi="Times New Roman"/>
+          <w:b/>
+          <w:bCs/>
+          <w:color w:val="000000"/>
+        </w:rPr>
+        <w:t xml:space="preserve">Уже вставлено</w:t>
+      </w:r>
+      <w:r>
+        <w:rPr>
+          <w:rFonts w:ascii="Times New Roman" w:hAnsi="Times New Roman"/>
+          <w:color w:val="000000"/>
+        </w:rPr>
+        <w:t xml:space="preserve"> </w:t>
+      </w:r>
+      <w:r>
+        <w:rPr>
+          <w:rFonts w:ascii="Times New Roman" w:hAnsi="Times New Roman"/>
+          <w:color w:val="000000"/>
+        </w:rPr>
+        <w:t xml:space="preserve">(PNG:</w:t>
+      </w:r>
+      <w:r>
+        <w:rPr>
+          <w:rFonts w:ascii="Times New Roman" w:hAnsi="Times New Roman"/>
+          <w:color w:val="000000"/>
+        </w:rPr>
+        <w:t xml:space="preserve"> </w:t>
+      </w:r>
+      <w:r>
+        <w:rPr>
+          <w:rStyle w:val="VerbatimChar"/>
+          <w:rFonts w:ascii="Times New Roman" w:hAnsi="Times New Roman"/>
+          <w:color w:val="000000"/>
+        </w:rPr>
+        <w:t xml:space="preserve">docs/diagrams/png/06-state-pattern-log.png</w:t>
+      </w:r>
+      <w:r>
+        <w:rPr>
+          <w:rFonts w:ascii="Times New Roman" w:hAnsi="Times New Roman"/>
+          <w:color w:val="000000"/>
+        </w:rPr>
+        <w:t xml:space="preserve">).</w:t>
       </w:r>
     </w:p>
     <w:p>
@@ -5897,6 +6209,84 @@
         </w:rPr>
         <w:t xml:space="preserve">).</w:t>
       </w:r>
+    </w:p>
+    <w:p>
+      <w:pPr>
+        <w:pStyle w:val="BlockText"/>
+      </w:pPr>
+      <w:r>
+        <w:rPr>
+          <w:rFonts w:ascii="Times New Roman" w:hAnsi="Times New Roman"/>
+          <w:b/>
+          <w:bCs/>
+          <w:color w:val="000000"/>
+        </w:rPr>
+        <w:t xml:space="preserve">Подпись под рисунком:</w:t>
+      </w:r>
+      <w:r>
+        <w:rPr>
+          <w:rFonts w:ascii="Times New Roman" w:hAnsi="Times New Roman"/>
+          <w:color w:val="000000"/>
+        </w:rPr>
+        <w:t xml:space="preserve"> </w:t>
+      </w:r>
+      <w:r>
+        <w:rPr>
+          <w:rFonts w:ascii="Times New Roman" w:hAnsi="Times New Roman"/>
+          <w:color w:val="000000"/>
+        </w:rPr>
+        <w:t xml:space="preserve">«Рисунок 8 — Последовательность формирования данных календаря месяца»</w:t>
+      </w:r>
+    </w:p>
+    <w:p>
+      <w:pPr>
+        <w:pStyle w:val="BlockText"/>
+      </w:pPr>
+      <w:r>
+        <w:rPr>
+          <w:rFonts w:ascii="Times New Roman" w:hAnsi="Times New Roman"/>
+          <w:b/>
+          <w:bCs/>
+          <w:color w:val="000000"/>
+        </w:rPr>
+        <w:t xml:space="preserve">Уже вставлено</w:t>
+      </w:r>
+      <w:r>
+        <w:rPr>
+          <w:rFonts w:ascii="Times New Roman" w:hAnsi="Times New Roman"/>
+          <w:color w:val="000000"/>
+        </w:rPr>
+        <w:t xml:space="preserve"> </w:t>
+      </w:r>
+      <w:r>
+        <w:rPr>
+          <w:rFonts w:ascii="Times New Roman" w:hAnsi="Times New Roman"/>
+          <w:color w:val="000000"/>
+        </w:rPr>
+        <w:t xml:space="preserve">(PNG:</w:t>
+      </w:r>
+      <w:r>
+        <w:rPr>
+          <w:rFonts w:ascii="Times New Roman" w:hAnsi="Times New Roman"/>
+          <w:color w:val="000000"/>
+        </w:rPr>
+        <w:t xml:space="preserve"> </w:t>
+      </w:r>
+      <w:r>
+        <w:rPr>
+          <w:rStyle w:val="VerbatimChar"/>
+          <w:rFonts w:ascii="Times New Roman" w:hAnsi="Times New Roman"/>
+          <w:color w:val="000000"/>
+        </w:rPr>
+        <w:t xml:space="preserve">docs/diagrams/png/08-sequence-calendar.png</w:t>
+      </w:r>
+      <w:r>
+        <w:rPr>
+          <w:rFonts w:ascii="Times New Roman" w:hAnsi="Times New Roman"/>
+          <w:color w:val="000000"/>
+        </w:rPr>
+        <w:t xml:space="preserve">).</w:t>
+      </w:r>
       <w:r>
         <w:rPr>
           <w:rFonts w:ascii="Times New Roman" w:hAnsi="Times New Roman"/>
@@ -5988,6 +6378,84 @@
           <w:color w:val="000000"/>
         </w:rPr>
         <w:t xml:space="preserve">Фоновые задания без участия пользователя: порождение повторяющихся задач; подготовка слотов привычек на день; закрытие просроченных откликов; обновление материализованных агрегатов; архивирование журнала аудита.</w:t>
+      </w:r>
+    </w:p>
+    <w:p>
+      <w:pPr>
+        <w:pStyle w:val="BlockText"/>
+      </w:pPr>
+      <w:r>
+        <w:rPr>
+          <w:rFonts w:ascii="Times New Roman" w:hAnsi="Times New Roman"/>
+          <w:b/>
+          <w:bCs/>
+          <w:color w:val="000000"/>
+        </w:rPr>
+        <w:t xml:space="preserve">Подпись под рисунком:</w:t>
+      </w:r>
+      <w:r>
+        <w:rPr>
+          <w:rFonts w:ascii="Times New Roman" w:hAnsi="Times New Roman"/>
+          <w:color w:val="000000"/>
+        </w:rPr>
+        <w:t xml:space="preserve"> </w:t>
+      </w:r>
+      <w:r>
+        <w:rPr>
+          <w:rFonts w:ascii="Times New Roman" w:hAnsi="Times New Roman"/>
+          <w:color w:val="000000"/>
+        </w:rPr>
+        <w:t xml:space="preserve">«Рисунок 7 — Диаграмма деятельности регламентных заданий»</w:t>
+      </w:r>
+    </w:p>
+    <w:p>
+      <w:pPr>
+        <w:pStyle w:val="BlockText"/>
+      </w:pPr>
+      <w:r>
+        <w:rPr>
+          <w:rFonts w:ascii="Times New Roman" w:hAnsi="Times New Roman"/>
+          <w:b/>
+          <w:bCs/>
+          <w:color w:val="000000"/>
+        </w:rPr>
+        <w:t xml:space="preserve">Уже вставлено</w:t>
+      </w:r>
+      <w:r>
+        <w:rPr>
+          <w:rFonts w:ascii="Times New Roman" w:hAnsi="Times New Roman"/>
+          <w:color w:val="000000"/>
+        </w:rPr>
+        <w:t xml:space="preserve"> </w:t>
+      </w:r>
+      <w:r>
+        <w:rPr>
+          <w:rFonts w:ascii="Times New Roman" w:hAnsi="Times New Roman"/>
+          <w:color w:val="000000"/>
+        </w:rPr>
+        <w:t xml:space="preserve">(PNG:</w:t>
+      </w:r>
+      <w:r>
+        <w:rPr>
+          <w:rFonts w:ascii="Times New Roman" w:hAnsi="Times New Roman"/>
+          <w:color w:val="000000"/>
+        </w:rPr>
+        <w:t xml:space="preserve"> </w:t>
+      </w:r>
+      <w:r>
+        <w:rPr>
+          <w:rStyle w:val="VerbatimChar"/>
+          <w:rFonts w:ascii="Times New Roman" w:hAnsi="Times New Roman"/>
+          <w:color w:val="000000"/>
+        </w:rPr>
+        <w:t xml:space="preserve">docs/diagrams/png/07-activity-daily.png</w:t>
+      </w:r>
+      <w:r>
+        <w:rPr>
+          <w:rFonts w:ascii="Times New Roman" w:hAnsi="Times New Roman"/>
+          <w:color w:val="000000"/>
+        </w:rPr>
+        <w:t xml:space="preserve">).</w:t>
       </w:r>
     </w:p>
     <w:p>
@@ -8474,6 +8942,84 @@
         </w:rPr>
         <w:t xml:space="preserve">).</w:t>
       </w:r>
+    </w:p>
+    <w:p>
+      <w:pPr>
+        <w:pStyle w:val="BlockText"/>
+      </w:pPr>
+      <w:r>
+        <w:rPr>
+          <w:rFonts w:ascii="Times New Roman" w:hAnsi="Times New Roman"/>
+          <w:b/>
+          <w:bCs/>
+          <w:color w:val="000000"/>
+        </w:rPr>
+        <w:t xml:space="preserve">Подпись под рисунком:</w:t>
+      </w:r>
+      <w:r>
+        <w:rPr>
+          <w:rFonts w:ascii="Times New Roman" w:hAnsi="Times New Roman"/>
+          <w:color w:val="000000"/>
+        </w:rPr>
+        <w:t xml:space="preserve"> </w:t>
+      </w:r>
+      <w:r>
+        <w:rPr>
+          <w:rFonts w:ascii="Times New Roman" w:hAnsi="Times New Roman"/>
+          <w:color w:val="000000"/>
+        </w:rPr>
+        <w:t xml:space="preserve">«Рисунок 2 — Трёхзвенная архитектура и слой PostgreSQL»</w:t>
+      </w:r>
+    </w:p>
+    <w:p>
+      <w:pPr>
+        <w:pStyle w:val="BlockText"/>
+      </w:pPr>
+      <w:r>
+        <w:rPr>
+          <w:rFonts w:ascii="Times New Roman" w:hAnsi="Times New Roman"/>
+          <w:b/>
+          <w:bCs/>
+          <w:color w:val="000000"/>
+        </w:rPr>
+        <w:t xml:space="preserve">Уже вставлено</w:t>
+      </w:r>
+      <w:r>
+        <w:rPr>
+          <w:rFonts w:ascii="Times New Roman" w:hAnsi="Times New Roman"/>
+          <w:color w:val="000000"/>
+        </w:rPr>
+        <w:t xml:space="preserve"> </w:t>
+      </w:r>
+      <w:r>
+        <w:rPr>
+          <w:rFonts w:ascii="Times New Roman" w:hAnsi="Times New Roman"/>
+          <w:color w:val="000000"/>
+        </w:rPr>
+        <w:t xml:space="preserve">(PNG:</w:t>
+      </w:r>
+      <w:r>
+        <w:rPr>
+          <w:rFonts w:ascii="Times New Roman" w:hAnsi="Times New Roman"/>
+          <w:color w:val="000000"/>
+        </w:rPr>
+        <w:t xml:space="preserve"> </w:t>
+      </w:r>
+      <w:r>
+        <w:rPr>
+          <w:rStyle w:val="VerbatimChar"/>
+          <w:rFonts w:ascii="Times New Roman" w:hAnsi="Times New Roman"/>
+          <w:color w:val="000000"/>
+        </w:rPr>
+        <w:t xml:space="preserve">docs/diagrams/png/02-architecture.png</w:t>
+      </w:r>
+      <w:r>
+        <w:rPr>
+          <w:rFonts w:ascii="Times New Roman" w:hAnsi="Times New Roman"/>
+          <w:color w:val="000000"/>
+        </w:rPr>
+        <w:t xml:space="preserve">).</w:t>
+      </w:r>
       <w:r>
         <w:rPr>
           <w:rFonts w:ascii="Times New Roman" w:hAnsi="Times New Roman"/>
@@ -10071,6 +10617,84 @@
           <w:color w:val="000000"/>
         </w:rPr>
         <w:t xml:space="preserve">Концептуальная модель в нотации «воронья лапка»: сущности users, topics, tags, tasks, recurring_rules, diary_entries, behavior_patterns (режимы habit / scenario / markers — разные группы таблиц), goals, goal_links, holidays; связи 1:N и M:N (task_tags, diary_tags). Отражены суррогатные ключи и основные атрибуты сущностей.</w:t>
+      </w:r>
+    </w:p>
+    <w:p>
+      <w:pPr>
+        <w:pStyle w:val="BlockText"/>
+      </w:pPr>
+      <w:r>
+        <w:rPr>
+          <w:rFonts w:ascii="Times New Roman" w:hAnsi="Times New Roman"/>
+          <w:b/>
+          <w:bCs/>
+          <w:color w:val="000000"/>
+        </w:rPr>
+        <w:t xml:space="preserve">Подпись под рисунком:</w:t>
+      </w:r>
+      <w:r>
+        <w:rPr>
+          <w:rFonts w:ascii="Times New Roman" w:hAnsi="Times New Roman"/>
+          <w:color w:val="000000"/>
+        </w:rPr>
+        <w:t xml:space="preserve"> </w:t>
+      </w:r>
+      <w:r>
+        <w:rPr>
+          <w:rFonts w:ascii="Times New Roman" w:hAnsi="Times New Roman"/>
+          <w:color w:val="000000"/>
+        </w:rPr>
+        <w:t xml:space="preserve">«Рисунок 1 — ER-диаграмма базы данных ПТТ»</w:t>
+      </w:r>
+    </w:p>
+    <w:p>
+      <w:pPr>
+        <w:pStyle w:val="BlockText"/>
+      </w:pPr>
+      <w:r>
+        <w:rPr>
+          <w:rFonts w:ascii="Times New Roman" w:hAnsi="Times New Roman"/>
+          <w:b/>
+          <w:bCs/>
+          <w:color w:val="000000"/>
+        </w:rPr>
+        <w:t xml:space="preserve">Уже вставлено</w:t>
+      </w:r>
+      <w:r>
+        <w:rPr>
+          <w:rFonts w:ascii="Times New Roman" w:hAnsi="Times New Roman"/>
+          <w:color w:val="000000"/>
+        </w:rPr>
+        <w:t xml:space="preserve"> </w:t>
+      </w:r>
+      <w:r>
+        <w:rPr>
+          <w:rFonts w:ascii="Times New Roman" w:hAnsi="Times New Roman"/>
+          <w:color w:val="000000"/>
+        </w:rPr>
+        <w:t xml:space="preserve">(PNG:</w:t>
+      </w:r>
+      <w:r>
+        <w:rPr>
+          <w:rFonts w:ascii="Times New Roman" w:hAnsi="Times New Roman"/>
+          <w:color w:val="000000"/>
+        </w:rPr>
+        <w:t xml:space="preserve"> </w:t>
+      </w:r>
+      <w:r>
+        <w:rPr>
+          <w:rStyle w:val="VerbatimChar"/>
+          <w:rFonts w:ascii="Times New Roman" w:hAnsi="Times New Roman"/>
+          <w:color w:val="000000"/>
+        </w:rPr>
+        <w:t xml:space="preserve">docs/diagrams/png/01-er-full.png</w:t>
+      </w:r>
+      <w:r>
+        <w:rPr>
+          <w:rFonts w:ascii="Times New Roman" w:hAnsi="Times New Roman"/>
+          <w:color w:val="000000"/>
+        </w:rPr>
+        <w:t xml:space="preserve">).</w:t>
       </w:r>
     </w:p>
     <w:p>
@@ -27595,6 +28219,77 @@
           <w:bCs/>
           <w:color w:val="000000"/>
         </w:rPr>
+        <w:t xml:space="preserve">Файл для вставки:</w:t>
+      </w:r>
+      <w:r>
+        <w:rPr>
+          <w:rFonts w:ascii="Times New Roman" w:hAnsi="Times New Roman"/>
+          <w:color w:val="000000"/>
+        </w:rPr>
+        <w:t xml:space="preserve"> </w:t>
+      </w:r>
+      <w:r>
+        <w:rPr>
+          <w:rStyle w:val="VerbatimChar"/>
+          <w:rFonts w:ascii="Times New Roman" w:hAnsi="Times New Roman"/>
+          <w:color w:val="000000"/>
+        </w:rPr>
+        <w:t xml:space="preserve">docs/diagrams/png/09-olap-star.png</w:t>
+      </w:r>
+      <w:r>
+        <w:rPr>
+          <w:rFonts w:ascii="Times New Roman" w:hAnsi="Times New Roman"/>
+          <w:color w:val="000000"/>
+        </w:rPr>
+        <w:t xml:space="preserve"> </w:t>
+      </w:r>
+      <w:r>
+        <w:rPr>
+          <w:rFonts w:ascii="Times New Roman" w:hAnsi="Times New Roman"/>
+          <w:color w:val="000000"/>
+        </w:rPr>
+        <w:t xml:space="preserve">(готов (PNG в репозитории)).</w:t>
+      </w:r>
+    </w:p>
+    <w:p>
+      <w:pPr>
+        <w:pStyle w:val="BlockText"/>
+      </w:pPr>
+      <w:r>
+        <w:rPr>
+          <w:rFonts w:ascii="Times New Roman" w:hAnsi="Times New Roman"/>
+          <w:b/>
+          <w:bCs/>
+          <w:color w:val="000000"/>
+        </w:rPr>
+        <w:t xml:space="preserve">Подпись под рисунком:</w:t>
+      </w:r>
+      <w:r>
+        <w:rPr>
+          <w:rFonts w:ascii="Times New Roman" w:hAnsi="Times New Roman"/>
+          <w:color w:val="000000"/>
+        </w:rPr>
+        <w:t xml:space="preserve"> </w:t>
+      </w:r>
+      <w:r>
+        <w:rPr>
+          <w:rFonts w:ascii="Times New Roman" w:hAnsi="Times New Roman"/>
+          <w:color w:val="000000"/>
+        </w:rPr>
+        <w:t xml:space="preserve">«Рисунок 9 — Зерно OLAP и источники фактов»</w:t>
+      </w:r>
+    </w:p>
+    <w:p>
+      <w:pPr>
+        <w:pStyle w:val="BlockText"/>
+      </w:pPr>
+      <w:r>
+        <w:rPr>
+          <w:rFonts w:ascii="Times New Roman" w:hAnsi="Times New Roman"/>
+          <w:b/>
+          <w:bCs/>
+          <w:color w:val="000000"/>
+        </w:rPr>
         <w:t xml:space="preserve">Вставить:</w:t>
       </w:r>
       <w:r>
@@ -28863,6 +29558,62 @@
           <w:color w:val="000000"/>
         </w:rPr>
         <w:t xml:space="preserve">Скриншот страницы «Статистика»: блок выбора измерений (неделя, месяц, день недели, корзины mood/energy) и мер (доля выполненных задач, среднее настроение, минуты Pomodoro и др.), кнопка построения среза.</w:t>
+      </w:r>
+    </w:p>
+    <w:p>
+      <w:pPr>
+        <w:pStyle w:val="BlockText"/>
+      </w:pPr>
+      <w:r>
+        <w:rPr>
+          <w:rFonts w:ascii="Times New Roman" w:hAnsi="Times New Roman"/>
+          <w:b/>
+          <w:bCs/>
+          <w:color w:val="000000"/>
+        </w:rPr>
+        <w:t xml:space="preserve">Подпись под рисунком:</w:t>
+      </w:r>
+      <w:r>
+        <w:rPr>
+          <w:rFonts w:ascii="Times New Roman" w:hAnsi="Times New Roman"/>
+          <w:color w:val="000000"/>
+        </w:rPr>
+        <w:t xml:space="preserve"> </w:t>
+      </w:r>
+      <w:r>
+        <w:rPr>
+          <w:rFonts w:ascii="Times New Roman" w:hAnsi="Times New Roman"/>
+          <w:color w:val="000000"/>
+        </w:rPr>
+        <w:t xml:space="preserve">«Рисунок 10 — Интерфейс OLAP-конструктора»</w:t>
+      </w:r>
+    </w:p>
+    <w:p>
+      <w:pPr>
+        <w:pStyle w:val="BlockText"/>
+      </w:pPr>
+      <w:r>
+        <w:rPr>
+          <w:rFonts w:ascii="Times New Roman" w:hAnsi="Times New Roman"/>
+          <w:b/>
+          <w:bCs/>
+          <w:color w:val="000000"/>
+        </w:rPr>
+        <w:t xml:space="preserve">Скриншот (вставить вручную):</w:t>
+      </w:r>
+      <w:r>
+        <w:rPr>
+          <w:rFonts w:ascii="Times New Roman" w:hAnsi="Times New Roman"/>
+          <w:color w:val="000000"/>
+        </w:rPr>
+        <w:t xml:space="preserve"> </w:t>
+      </w:r>
+      <w:r>
+        <w:rPr>
+          <w:rFonts w:ascii="Times New Roman" w:hAnsi="Times New Roman"/>
+          <w:color w:val="000000"/>
+        </w:rPr>
+        <w:t xml:space="preserve">страница «Статистика» → блок OLAP (localhost после docker compose up).</w:t>
       </w:r>
     </w:p>
     <w:p>
@@ -32102,75 +32853,146 @@
           <w:bCs/>
           <w:color w:val="000000"/>
         </w:rPr>
-        <w:t xml:space="preserve">Вставить:</w:t>
-      </w:r>
-      <w:r>
-        <w:rPr>
-          <w:rFonts w:ascii="Times New Roman" w:hAnsi="Times New Roman"/>
-          <w:color w:val="000000"/>
-        </w:rPr>
-        <w:t xml:space="preserve"> </w:t>
-      </w:r>
-      <w:r>
-        <w:rPr>
-          <w:rFonts w:ascii="Times New Roman" w:hAnsi="Times New Roman"/>
-          <w:color w:val="000000"/>
-        </w:rPr>
-        <w:t xml:space="preserve">docs/benchmark_explain_out.txt, блок Q1 (приложение Е).</w:t>
-      </w:r>
-      <w:r>
-        <w:rPr>
-          <w:rFonts w:ascii="Times New Roman" w:hAnsi="Times New Roman"/>
-          <w:color w:val="000000"/>
-        </w:rPr>
-        <w:t xml:space="preserve"> </w:t>
-      </w:r>
-      <w:r>
-        <w:rPr>
-          <w:rFonts w:ascii="Times New Roman" w:hAnsi="Times New Roman"/>
-          <w:color w:val="000000"/>
-        </w:rPr>
-        <w:t xml:space="preserve">«Рисунок 11 — План запроса календаря месяца при наборе S2».*</w:t>
+        <w:t xml:space="preserve">Файл для вставки:</w:t>
+      </w:r>
+      <w:r>
+        <w:rPr>
+          <w:rFonts w:ascii="Times New Roman" w:hAnsi="Times New Roman"/>
+          <w:color w:val="000000"/>
+        </w:rPr>
+        <w:t xml:space="preserve"> </w:t>
+      </w:r>
+      <w:r>
+        <w:rPr>
+          <w:rStyle w:val="VerbatimChar"/>
+          <w:rFonts w:ascii="Times New Roman" w:hAnsi="Times New Roman"/>
+          <w:color w:val="000000"/>
+        </w:rPr>
+        <w:t xml:space="preserve">docs/diagrams/png/11-explain-q1-calendar.png</w:t>
+      </w:r>
+      <w:r>
+        <w:rPr>
+          <w:rFonts w:ascii="Times New Roman" w:hAnsi="Times New Roman"/>
+          <w:color w:val="000000"/>
+        </w:rPr>
+        <w:t xml:space="preserve"> </w:t>
+      </w:r>
+      <w:r>
+        <w:rPr>
+          <w:rFonts w:ascii="Times New Roman" w:hAnsi="Times New Roman"/>
+          <w:color w:val="000000"/>
+        </w:rPr>
+        <w:t xml:space="preserve">(готов (PNG в репозитории)).</w:t>
       </w:r>
     </w:p>
     <w:p>
       <w:pPr>
-        <w:pStyle w:val="GOSTFigureCaption"/>
-      </w:pPr>
-      <w:r>
-        <w:rPr>
-          <w:rFonts w:ascii="Times New Roman" w:hAnsi="Times New Roman"/>
-          <w:color w:val="000000"/>
-        </w:rPr>
-        <w:t xml:space="preserve">Рисунок 12 — Планы полнотекстового поиска дневника (Q2a и Q2b)</w:t>
+        <w:pStyle w:val="BlockText"/>
+      </w:pPr>
+      <w:r>
+        <w:rPr>
+          <w:rFonts w:ascii="Times New Roman" w:hAnsi="Times New Roman"/>
+          <w:b/>
+          <w:bCs/>
+          <w:color w:val="000000"/>
+        </w:rPr>
+        <w:t xml:space="preserve">Подпись под рисунком:</w:t>
+      </w:r>
+      <w:r>
+        <w:rPr>
+          <w:rFonts w:ascii="Times New Roman" w:hAnsi="Times New Roman"/>
+          <w:color w:val="000000"/>
+        </w:rPr>
+        <w:t xml:space="preserve"> </w:t>
+      </w:r>
+      <w:r>
+        <w:rPr>
+          <w:rFonts w:ascii="Times New Roman" w:hAnsi="Times New Roman"/>
+          <w:color w:val="000000"/>
+        </w:rPr>
+        <w:t xml:space="preserve">«Рисунок 11 — План запроса календаря месяца при наборе S2»</w:t>
       </w:r>
     </w:p>
     <w:p>
       <w:pPr>
-        <w:pStyle w:val="GOSTPlaceholder"/>
-      </w:pPr>
-      <w:r>
-        <w:rPr>
-          <w:rFonts w:ascii="Times New Roman" w:hAnsi="Times New Roman"/>
-          <w:color w:val="000000"/>
-        </w:rPr>
-        <w:t xml:space="preserve">Рисунок 12 — Планы полнотекстового поиска дневника (Q2a и Q2b)</w:t>
+        <w:pStyle w:val="BlockText"/>
+      </w:pPr>
+      <w:r>
+        <w:rPr>
+          <w:rFonts w:ascii="Times New Roman" w:hAnsi="Times New Roman"/>
+          <w:b/>
+          <w:bCs/>
+          <w:color w:val="000000"/>
+        </w:rPr>
+        <w:t xml:space="preserve">Вставить:</w:t>
+      </w:r>
+      <w:r>
+        <w:rPr>
+          <w:rFonts w:ascii="Times New Roman" w:hAnsi="Times New Roman"/>
+          <w:color w:val="000000"/>
+        </w:rPr>
+        <w:t xml:space="preserve"> </w:t>
+      </w:r>
+      <w:r>
+        <w:rPr>
+          <w:rFonts w:ascii="Times New Roman" w:hAnsi="Times New Roman"/>
+          <w:color w:val="000000"/>
+        </w:rPr>
+        <w:t xml:space="preserve">docs/benchmark_explain_out.txt, блок Q1 (приложение Е).</w:t>
+      </w:r>
+      <w:r>
+        <w:rPr>
+          <w:rFonts w:ascii="Times New Roman" w:hAnsi="Times New Roman"/>
+          <w:color w:val="000000"/>
+        </w:rPr>
+        <w:t xml:space="preserve"> </w:t>
+      </w:r>
+      <w:r>
+        <w:rPr>
+          <w:rFonts w:ascii="Times New Roman" w:hAnsi="Times New Roman"/>
+          <w:color w:val="000000"/>
+        </w:rPr>
+        <w:t xml:space="preserve">«Рисунок 11 — План запроса календаря месяца при наборе S2».*</w:t>
       </w:r>
     </w:p>
     <w:p>
       <w:pPr>
-        <w:pStyle w:val="GOSTPlaceholder"/>
-      </w:pPr>
-      <w:r>
-        <w:rPr>
-          <w:rFonts w:ascii="Times New Roman" w:hAnsi="Times New Roman"/>
-          <w:color w:val="000000"/>
-        </w:rPr>
-        <w:t xml:space="preserve">Содержание рисунка. Два плана fn_search_diary: Q2a — без GIN-индекса; Q2b — с idx_diary_fts_gin; сравнение типа сканирования и времени на наборе S2.</w:t>
+        <w:pStyle w:val="GOSTFigureCaption"/>
+      </w:pPr>
+      <w:r>
+        <w:rPr>
+          <w:rFonts w:ascii="Times New Roman" w:hAnsi="Times New Roman"/>
+          <w:color w:val="000000"/>
+        </w:rPr>
+        <w:t xml:space="preserve">Рисунок 12 — Планы полнотекстового поиска дневника (Q2a и Q2b)</w:t>
       </w:r>
     </w:p>
     <w:p>
       <w:pPr>
+        <w:pStyle w:val="GOSTPlaceholder"/>
+      </w:pPr>
+      <w:r>
+        <w:rPr>
+          <w:rFonts w:ascii="Times New Roman" w:hAnsi="Times New Roman"/>
+          <w:color w:val="000000"/>
+        </w:rPr>
+        <w:t xml:space="preserve">Рисунок 12 — Планы полнотекстового поиска дневника (Q2a и Q2b)</w:t>
+      </w:r>
+    </w:p>
+    <w:p>
+      <w:pPr>
+        <w:pStyle w:val="GOSTPlaceholder"/>
+      </w:pPr>
+      <w:r>
+        <w:rPr>
+          <w:rFonts w:ascii="Times New Roman" w:hAnsi="Times New Roman"/>
+          <w:color w:val="000000"/>
+        </w:rPr>
+        <w:t xml:space="preserve">Содержание рисунка. Два плана fn_search_diary: Q2a — без GIN-индекса; Q2b — с idx_diary_fts_gin; сравнение типа сканирования и времени на наборе S2.</w:t>
+      </w:r>
+    </w:p>
+    <w:p>
+      <w:pPr>
         <w:pStyle w:val="BlockText"/>
       </w:pPr>
       <w:r>
@@ -32236,35 +33058,7 @@
           <w:bCs/>
           <w:color w:val="000000"/>
         </w:rPr>
-        <w:t xml:space="preserve">Вставить:</w:t>
-      </w:r>
-      <w:r>
-        <w:rPr>
-          <w:rFonts w:ascii="Times New Roman" w:hAnsi="Times New Roman"/>
-          <w:color w:val="000000"/>
-        </w:rPr>
-        <w:t xml:space="preserve"> </w:t>
-      </w:r>
-      <w:r>
-        <w:rPr>
-          <w:rFonts w:ascii="Times New Roman" w:hAnsi="Times New Roman"/>
-          <w:color w:val="000000"/>
-        </w:rPr>
-        <w:t xml:space="preserve">docs/benchmark_explain_out.txt, блоки Q2a и Q2b.</w:t>
-      </w:r>
-      <w:r>
-        <w:rPr>
-          <w:rFonts w:ascii="Times New Roman" w:hAnsi="Times New Roman"/>
-          <w:color w:val="000000"/>
-        </w:rPr>
-        <w:t xml:space="preserve"> </w:t>
-      </w:r>
-      <w:r>
-        <w:rPr>
-          <w:rFonts w:ascii="Times New Roman" w:hAnsi="Times New Roman"/>
-          <w:color w:val="000000"/>
-        </w:rPr>
-        <w:t xml:space="preserve">«Рисунок 12 — Планы</w:t>
+        <w:t xml:space="preserve">Файл для вставки:</w:t>
       </w:r>
       <w:r>
         <w:rPr>
@@ -32279,61 +33073,160 @@
           <w:rFonts w:ascii="Times New Roman" w:hAnsi="Times New Roman"/>
           <w:color w:val="000000"/>
         </w:rPr>
-        <w:t xml:space="preserve">fn_search_diary</w:t>
-      </w:r>
-      <w:r>
-        <w:rPr>
-          <w:rFonts w:ascii="Times New Roman" w:hAnsi="Times New Roman"/>
-          <w:color w:val="000000"/>
-        </w:rPr>
-        <w:t xml:space="preserve"> </w:t>
-      </w:r>
-      <w:r>
-        <w:rPr>
-          <w:rFonts w:ascii="Times New Roman" w:hAnsi="Times New Roman"/>
-          <w:color w:val="000000"/>
-        </w:rPr>
-        <w:t xml:space="preserve">до и после индекса GIN».*</w:t>
+        <w:t xml:space="preserve">docs/diagrams/png/12-explain-q2a-q2b-diary.png</w:t>
+      </w:r>
+      <w:r>
+        <w:rPr>
+          <w:rFonts w:ascii="Times New Roman" w:hAnsi="Times New Roman"/>
+          <w:color w:val="000000"/>
+        </w:rPr>
+        <w:t xml:space="preserve"> </w:t>
+      </w:r>
+      <w:r>
+        <w:rPr>
+          <w:rFonts w:ascii="Times New Roman" w:hAnsi="Times New Roman"/>
+          <w:color w:val="000000"/>
+        </w:rPr>
+        <w:t xml:space="preserve">(готов (PNG в репозитории)).</w:t>
       </w:r>
     </w:p>
     <w:p>
       <w:pPr>
-        <w:pStyle w:val="GOSTFigureCaption"/>
-      </w:pPr>
-      <w:r>
-        <w:rPr>
-          <w:rFonts w:ascii="Times New Roman" w:hAnsi="Times New Roman"/>
-          <w:color w:val="000000"/>
-        </w:rPr>
-        <w:t xml:space="preserve">Рисунок 13 — План фильтра задач по составному индексу</w:t>
+        <w:pStyle w:val="BlockText"/>
+      </w:pPr>
+      <w:r>
+        <w:rPr>
+          <w:rFonts w:ascii="Times New Roman" w:hAnsi="Times New Roman"/>
+          <w:b/>
+          <w:bCs/>
+          <w:color w:val="000000"/>
+        </w:rPr>
+        <w:t xml:space="preserve">Подпись под рисунком:</w:t>
+      </w:r>
+      <w:r>
+        <w:rPr>
+          <w:rFonts w:ascii="Times New Roman" w:hAnsi="Times New Roman"/>
+          <w:color w:val="000000"/>
+        </w:rPr>
+        <w:t xml:space="preserve"> </w:t>
+      </w:r>
+      <w:r>
+        <w:rPr>
+          <w:rFonts w:ascii="Times New Roman" w:hAnsi="Times New Roman"/>
+          <w:color w:val="000000"/>
+        </w:rPr>
+        <w:t xml:space="preserve">«Рисунок 12 — Планы полнотекстового поиска дневника (Q2a и Q2b)»</w:t>
       </w:r>
     </w:p>
     <w:p>
       <w:pPr>
-        <w:pStyle w:val="GOSTPlaceholder"/>
-      </w:pPr>
-      <w:r>
-        <w:rPr>
-          <w:rFonts w:ascii="Times New Roman" w:hAnsi="Times New Roman"/>
-          <w:color w:val="000000"/>
-        </w:rPr>
-        <w:t xml:space="preserve">Рисунок 13 — План фильтра задач по составному индексу</w:t>
+        <w:pStyle w:val="BlockText"/>
+      </w:pPr>
+      <w:r>
+        <w:rPr>
+          <w:rFonts w:ascii="Times New Roman" w:hAnsi="Times New Roman"/>
+          <w:b/>
+          <w:bCs/>
+          <w:color w:val="000000"/>
+        </w:rPr>
+        <w:t xml:space="preserve">Вставить:</w:t>
+      </w:r>
+      <w:r>
+        <w:rPr>
+          <w:rFonts w:ascii="Times New Roman" w:hAnsi="Times New Roman"/>
+          <w:color w:val="000000"/>
+        </w:rPr>
+        <w:t xml:space="preserve"> </w:t>
+      </w:r>
+      <w:r>
+        <w:rPr>
+          <w:rFonts w:ascii="Times New Roman" w:hAnsi="Times New Roman"/>
+          <w:color w:val="000000"/>
+        </w:rPr>
+        <w:t xml:space="preserve">docs/benchmark_explain_out.txt, блоки Q2a и Q2b.</w:t>
+      </w:r>
+      <w:r>
+        <w:rPr>
+          <w:rFonts w:ascii="Times New Roman" w:hAnsi="Times New Roman"/>
+          <w:color w:val="000000"/>
+        </w:rPr>
+        <w:t xml:space="preserve"> </w:t>
+      </w:r>
+      <w:r>
+        <w:rPr>
+          <w:rFonts w:ascii="Times New Roman" w:hAnsi="Times New Roman"/>
+          <w:color w:val="000000"/>
+        </w:rPr>
+        <w:t xml:space="preserve">«Рисунок 12 — Планы</w:t>
+      </w:r>
+      <w:r>
+        <w:rPr>
+          <w:rFonts w:ascii="Times New Roman" w:hAnsi="Times New Roman"/>
+          <w:color w:val="000000"/>
+        </w:rPr>
+        <w:t xml:space="preserve"> </w:t>
+      </w:r>
+      <w:r>
+        <w:rPr>
+          <w:rStyle w:val="VerbatimChar"/>
+          <w:rFonts w:ascii="Times New Roman" w:hAnsi="Times New Roman"/>
+          <w:color w:val="000000"/>
+        </w:rPr>
+        <w:t xml:space="preserve">fn_search_diary</w:t>
+      </w:r>
+      <w:r>
+        <w:rPr>
+          <w:rFonts w:ascii="Times New Roman" w:hAnsi="Times New Roman"/>
+          <w:color w:val="000000"/>
+        </w:rPr>
+        <w:t xml:space="preserve"> </w:t>
+      </w:r>
+      <w:r>
+        <w:rPr>
+          <w:rFonts w:ascii="Times New Roman" w:hAnsi="Times New Roman"/>
+          <w:color w:val="000000"/>
+        </w:rPr>
+        <w:t xml:space="preserve">до и после индекса GIN».*</w:t>
       </w:r>
     </w:p>
     <w:p>
       <w:pPr>
-        <w:pStyle w:val="GOSTPlaceholder"/>
-      </w:pPr>
-      <w:r>
-        <w:rPr>
-          <w:rFonts w:ascii="Times New Roman" w:hAnsi="Times New Roman"/>
-          <w:color w:val="000000"/>
-        </w:rPr>
-        <w:t xml:space="preserve">Содержание рисунка. Фрагмент EXPLAIN для выборки задач по topic_id и status (Q3): использование idx_tasks_topic_status (Bitmap Index Scan → Bitmap Heap Scan).</w:t>
+        <w:pStyle w:val="GOSTFigureCaption"/>
+      </w:pPr>
+      <w:r>
+        <w:rPr>
+          <w:rFonts w:ascii="Times New Roman" w:hAnsi="Times New Roman"/>
+          <w:color w:val="000000"/>
+        </w:rPr>
+        <w:t xml:space="preserve">Рисунок 13 — План фильтра задач по составному индексу</w:t>
       </w:r>
     </w:p>
     <w:p>
       <w:pPr>
+        <w:pStyle w:val="GOSTPlaceholder"/>
+      </w:pPr>
+      <w:r>
+        <w:rPr>
+          <w:rFonts w:ascii="Times New Roman" w:hAnsi="Times New Roman"/>
+          <w:color w:val="000000"/>
+        </w:rPr>
+        <w:t xml:space="preserve">Рисунок 13 — План фильтра задач по составному индексу</w:t>
+      </w:r>
+    </w:p>
+    <w:p>
+      <w:pPr>
+        <w:pStyle w:val="GOSTPlaceholder"/>
+      </w:pPr>
+      <w:r>
+        <w:rPr>
+          <w:rFonts w:ascii="Times New Roman" w:hAnsi="Times New Roman"/>
+          <w:color w:val="000000"/>
+        </w:rPr>
+        <w:t xml:space="preserve">Содержание рисунка. Фрагмент EXPLAIN для выборки задач по topic_id и status (Q3): использование idx_tasks_topic_status (Bitmap Index Scan → Bitmap Heap Scan).</w:t>
+      </w:r>
+    </w:p>
+    <w:p>
+      <w:pPr>
         <w:pStyle w:val="BlockText"/>
       </w:pPr>
       <w:r>
@@ -32358,6 +33251,77 @@
           <w:color w:val="000000"/>
         </w:rPr>
         <w:t xml:space="preserve">Фрагмент EXPLAIN для выборки задач по topic_id и status (Q3): использование idx_tasks_topic_status (Bitmap Index Scan → Bitmap Heap Scan).</w:t>
+      </w:r>
+    </w:p>
+    <w:p>
+      <w:pPr>
+        <w:pStyle w:val="BlockText"/>
+      </w:pPr>
+      <w:r>
+        <w:rPr>
+          <w:rFonts w:ascii="Times New Roman" w:hAnsi="Times New Roman"/>
+          <w:b/>
+          <w:bCs/>
+          <w:color w:val="000000"/>
+        </w:rPr>
+        <w:t xml:space="preserve">Подпись под рисунком:</w:t>
+      </w:r>
+      <w:r>
+        <w:rPr>
+          <w:rFonts w:ascii="Times New Roman" w:hAnsi="Times New Roman"/>
+          <w:color w:val="000000"/>
+        </w:rPr>
+        <w:t xml:space="preserve"> </w:t>
+      </w:r>
+      <w:r>
+        <w:rPr>
+          <w:rFonts w:ascii="Times New Roman" w:hAnsi="Times New Roman"/>
+          <w:color w:val="000000"/>
+        </w:rPr>
+        <w:t xml:space="preserve">«Рисунок 13 — План фильтра задач по составному индексу»</w:t>
+      </w:r>
+    </w:p>
+    <w:p>
+      <w:pPr>
+        <w:pStyle w:val="BlockText"/>
+      </w:pPr>
+      <w:r>
+        <w:rPr>
+          <w:rFonts w:ascii="Times New Roman" w:hAnsi="Times New Roman"/>
+          <w:b/>
+          <w:bCs/>
+          <w:color w:val="000000"/>
+        </w:rPr>
+        <w:t xml:space="preserve">Файл для вставки:</w:t>
+      </w:r>
+      <w:r>
+        <w:rPr>
+          <w:rFonts w:ascii="Times New Roman" w:hAnsi="Times New Roman"/>
+          <w:color w:val="000000"/>
+        </w:rPr>
+        <w:t xml:space="preserve"> </w:t>
+      </w:r>
+      <w:r>
+        <w:rPr>
+          <w:rStyle w:val="VerbatimChar"/>
+          <w:rFonts w:ascii="Times New Roman" w:hAnsi="Times New Roman"/>
+          <w:color w:val="000000"/>
+        </w:rPr>
+        <w:t xml:space="preserve">docs/diagrams/png/13-explain-q3-tasks-index.png</w:t>
+      </w:r>
+      <w:r>
+        <w:rPr>
+          <w:rFonts w:ascii="Times New Roman" w:hAnsi="Times New Roman"/>
+          <w:color w:val="000000"/>
+        </w:rPr>
+        <w:t xml:space="preserve"> </w:t>
+      </w:r>
+      <w:r>
+        <w:rPr>
+          <w:rFonts w:ascii="Times New Roman" w:hAnsi="Times New Roman"/>
+          <w:color w:val="000000"/>
+        </w:rPr>
+        <w:t xml:space="preserve">(готов (PNG в репозитории)).</w:t>
       </w:r>
     </w:p>
     <w:p>

</xml_diff>